<commit_message>
feat: add Auth Service, Repo
</commit_message>
<xml_diff>
--- a/finflow-document.docx
+++ b/finflow-document.docx
@@ -919,6 +919,16 @@
     </w:p>
     <w:p>
       <w:r>
+        <w:t xml:space="preserve">    password VARCHAR(255) NOT NULL,</w:t>
+      </w:r>
+    </w:p>
+    <w:p>
+      <w:r>
+        <w:t xml:space="preserve">    phone_number VARCHAR(255) NOT NULL,</w:t>
+      </w:r>
+    </w:p>
+    <w:p>
+      <w:r>
         <w:t xml:space="preserve">    role VARCHAR(50) DEFAULT 'MEMBER' CHECK (role IN ('HEAD', 'MEMBER')), -- Vai trò</w:t>
       </w:r>
     </w:p>
@@ -943,124 +953,6 @@
         <w:t>-- 3. BẢNG SETTLEMENTS (Các kỳ chốt sổ hàng tháng)</w:t>
       </w:r>
     </w:p>
-    <w:p>
-      <w:r>
-        <w:t>-- ==========================================</w:t>
-      </w:r>
-    </w:p>
-    <w:p>
-      <w:r>
-        <w:t>CREATE TABLE settlements (</w:t>
-      </w:r>
-    </w:p>
-    <w:p>
-      <w:r>
-        <w:lastRenderedPageBreak/>
-        <w:t xml:space="preserve">    id UUID DEFAULT gen_random_uuid() PRIMARY KEY,</w:t>
-      </w:r>
-    </w:p>
-    <w:p>
-      <w:r>
-        <w:t xml:space="preserve">    family_id UUID REFERENCES families(id) ON DELETE CASCADE,</w:t>
-      </w:r>
-    </w:p>
-    <w:p>
-      <w:r>
-        <w:t xml:space="preserve">    month INT NOT NULL CHECK (month &gt;= 1 AND month &lt;= 12),</w:t>
-      </w:r>
-    </w:p>
-    <w:p>
-      <w:r>
-        <w:t xml:space="preserve">    year INT NOT NULL,</w:t>
-      </w:r>
-    </w:p>
-    <w:p>
-      <w:r>
-        <w:t xml:space="preserve">    status VARCHAR(50) DEFAULT 'PENDING' CHECK (status IN ('PENDING', 'COMPLETED')), -- COMPLETED khi tất cả đã thanh toán</w:t>
-      </w:r>
-    </w:p>
-    <w:p>
-      <w:r>
-        <w:t xml:space="preserve">    created_at TIMESTAMP WITH TIME ZONE DEFAULT CURRENT_TIMESTAMP</w:t>
-      </w:r>
-    </w:p>
-    <w:p>
-      <w:r>
-        <w:t>);</w:t>
-      </w:r>
-    </w:p>
-    <w:p/>
-    <w:p>
-      <w:r>
-        <w:t>-- ==========================================</w:t>
-      </w:r>
-    </w:p>
-    <w:p>
-      <w:r>
-        <w:t>-- 4. BẢNG EXPENSES (Khoản chi tiêu chung)</w:t>
-      </w:r>
-    </w:p>
-    <w:p>
-      <w:r>
-        <w:t>-- ==========================================</w:t>
-      </w:r>
-    </w:p>
-    <w:p>
-      <w:r>
-        <w:t>CREATE TABLE expenses (</w:t>
-      </w:r>
-    </w:p>
-    <w:p>
-      <w:r>
-        <w:t xml:space="preserve">    id UUID DEFAULT gen_random_uuid() PRIMARY KEY,</w:t>
-      </w:r>
-    </w:p>
-    <w:p>
-      <w:r>
-        <w:t xml:space="preserve">    family_id UUID REFERENCES families(id) ON DELETE CASCADE,</w:t>
-      </w:r>
-    </w:p>
-    <w:p>
-      <w:r>
-        <w:t xml:space="preserve">    settlement_id UUID REFERENCES settlements(id) ON DELETE SET NULL, -- Khoản chi này thuộc kỳ chốt sổ nào (NULL nếu chưa chốt)</w:t>
-      </w:r>
-    </w:p>
-    <w:p>
-      <w:r>
-        <w:t xml:space="preserve">    paid_by UUID REFERENCES users(id) ON DELETE CASCADE, -- Ai là người bỏ tiền túi ra trả</w:t>
-      </w:r>
-    </w:p>
-    <w:p>
-      <w:r>
-        <w:t xml:space="preserve">    title VARCHAR(255) NOT NULL,</w:t>
-      </w:r>
-    </w:p>
-    <w:p>
-      <w:r>
-        <w:t xml:space="preserve">    amount DECIMAL(15, 2) NOT NULL CHECK (amount &gt; 0), -- Số tiền (Dùng DECIMAL để tính toán chính xác)</w:t>
-      </w:r>
-    </w:p>
-    <w:p>
-      <w:r>
-        <w:t xml:space="preserve">    expense_date DATE NOT NULL,</w:t>
-      </w:r>
-    </w:p>
-    <w:p>
-      <w:r>
-        <w:t xml:space="preserve">    status VARCHAR(50) DEFAULT 'PENDING' CHECK (status IN ('PENDING', 'SETTLED')), -- Khóa bản ghi nếu đã SETTLED</w:t>
-      </w:r>
-    </w:p>
-    <w:p>
-      <w:r>
-        <w:t xml:space="preserve">    created_at TIMESTAMP WITH TIME ZONE DEFAULT CURRENT_TIMESTAMP</w:t>
-      </w:r>
-    </w:p>
-    <w:p>
-      <w:r>
-        <w:t>);</w:t>
-      </w:r>
-    </w:p>
-    <w:p/>
     <w:p>
       <w:r>
         <w:lastRenderedPageBreak/>
@@ -1069,14 +961,45 @@
     </w:p>
     <w:p>
       <w:r>
-        <w:t>-- 5. BẢNG EXPENSE_PARTICIPANTS (Những người thụ hưởng khoản chi)</w:t>
-      </w:r>
-    </w:p>
-    <w:p>
-      <w:r>
-        <w:t>-- Giải quyết bài toán: Nhà 4 người nhưng chỉ 3 người ăn chung</w:t>
-      </w:r>
-    </w:p>
+        <w:t>CREATE TABLE settlements (</w:t>
+      </w:r>
+    </w:p>
+    <w:p>
+      <w:r>
+        <w:t xml:space="preserve">    id UUID DEFAULT gen_random_uuid() PRIMARY KEY,</w:t>
+      </w:r>
+    </w:p>
+    <w:p>
+      <w:r>
+        <w:t xml:space="preserve">    family_id UUID REFERENCES families(id) ON DELETE CASCADE,</w:t>
+      </w:r>
+    </w:p>
+    <w:p>
+      <w:r>
+        <w:t xml:space="preserve">    month INT NOT NULL CHECK (month &gt;= 1 AND month &lt;= 12),</w:t>
+      </w:r>
+    </w:p>
+    <w:p>
+      <w:r>
+        <w:t xml:space="preserve">    year INT NOT NULL,</w:t>
+      </w:r>
+    </w:p>
+    <w:p>
+      <w:r>
+        <w:t xml:space="preserve">    status VARCHAR(50) DEFAULT 'PENDING' CHECK (status IN ('PENDING', 'COMPLETED')), -- COMPLETED khi tất cả đã thanh toán</w:t>
+      </w:r>
+    </w:p>
+    <w:p>
+      <w:r>
+        <w:t xml:space="preserve">    created_at TIMESTAMP WITH TIME ZONE DEFAULT CURRENT_TIMESTAMP</w:t>
+      </w:r>
+    </w:p>
+    <w:p>
+      <w:r>
+        <w:t>);</w:t>
+      </w:r>
+    </w:p>
+    <w:p/>
     <w:p>
       <w:r>
         <w:t>-- ==========================================</w:t>
@@ -1084,30 +1007,9 @@
     </w:p>
     <w:p>
       <w:r>
-        <w:t>CREATE TABLE expense_participants (</w:t>
-      </w:r>
-    </w:p>
-    <w:p>
-      <w:r>
-        <w:t xml:space="preserve">    expense_id UUID REFERENCES expenses(id) ON DELETE CASCADE,</w:t>
-      </w:r>
-    </w:p>
-    <w:p>
-      <w:r>
-        <w:t xml:space="preserve">    user_id UUID REFERENCES users(id) ON DELETE CASCADE,</w:t>
-      </w:r>
-    </w:p>
-    <w:p>
-      <w:r>
-        <w:t xml:space="preserve">    PRIMARY KEY (expense_id, user_id) -- Khóa chính kết hợp (Composite Key)</w:t>
-      </w:r>
-    </w:p>
-    <w:p>
-      <w:r>
-        <w:t>);</w:t>
-      </w:r>
-    </w:p>
-    <w:p/>
+        <w:t>-- 4. BẢNG EXPENSES (Khoản chi tiêu chung)</w:t>
+      </w:r>
+    </w:p>
     <w:p>
       <w:r>
         <w:t>-- ==========================================</w:t>
@@ -1115,22 +1017,7 @@
     </w:p>
     <w:p>
       <w:r>
-        <w:t>-- 6. BẢNG SETTLEMENT_BILLS (Hóa đơn công nợ của từng thành viên)</w:t>
-      </w:r>
-    </w:p>
-    <w:p>
-      <w:r>
-        <w:t>-- Tạo ra sau khi thuật toán chốt sổ chạy</w:t>
-      </w:r>
-    </w:p>
-    <w:p>
-      <w:r>
-        <w:t>-- ==========================================</w:t>
-      </w:r>
-    </w:p>
-    <w:p>
-      <w:r>
-        <w:t>CREATE TABLE settlement_bills (</w:t>
+        <w:t>CREATE TABLE expenses (</w:t>
       </w:r>
     </w:p>
     <w:p>
@@ -1140,42 +1027,37 @@
     </w:p>
     <w:p>
       <w:r>
-        <w:t xml:space="preserve">    settlement_id UUID REFERENCES settlements(id) ON DELETE CASCADE,</w:t>
-      </w:r>
-    </w:p>
-    <w:p>
-      <w:r>
-        <w:t xml:space="preserve">    user_id UUID REFERENCES users(id) ON DELETE CASCADE, -- Thành viên bị nợ hoặc có nợ</w:t>
-      </w:r>
-    </w:p>
-    <w:p>
-      <w:r>
-        <w:t xml:space="preserve">    amount DECIMAL(15, 2) NOT NULL, </w:t>
-      </w:r>
-    </w:p>
-    <w:p>
-      <w:r>
-        <w:t xml:space="preserve">    -- Ý nghĩa của amount: </w:t>
-      </w:r>
-    </w:p>
-    <w:p>
-      <w:r>
-        <w:t xml:space="preserve">    -- Giá trị DƯƠNG (&gt;0): Thành viên nợ Chủ hộ (Phải chuyển tiền cho chủ hộ)</w:t>
-      </w:r>
-    </w:p>
-    <w:p>
-      <w:r>
-        <w:t xml:space="preserve">    -- Giá trị ÂM (&lt;0): Thành viên đã chi lố tiền (Chủ hộ phải trả lại tiền cho người này)</w:t>
-      </w:r>
-    </w:p>
-    <w:p>
-      <w:r>
-        <w:t xml:space="preserve">    status VARCHAR(50) DEFAULT 'PENDING' CHECK (status IN ('PENDING', 'WAITING_FOR_CONFIRMATION', 'COMPLETED')),</w:t>
-      </w:r>
-    </w:p>
-    <w:p>
-      <w:r>
-        <w:t xml:space="preserve">    proof_image_url TEXT, -- Đường dẫn ảnh minh chứng chuyển khoản (Lưu trên Supabase Storage)</w:t>
+        <w:t xml:space="preserve">    family_id UUID REFERENCES families(id) ON DELETE CASCADE,</w:t>
+      </w:r>
+    </w:p>
+    <w:p>
+      <w:r>
+        <w:t xml:space="preserve">    settlement_id UUID REFERENCES settlements(id) ON DELETE SET NULL, -- Khoản chi này thuộc kỳ chốt sổ nào (NULL nếu chưa chốt)</w:t>
+      </w:r>
+    </w:p>
+    <w:p>
+      <w:r>
+        <w:t xml:space="preserve">    paid_by UUID REFERENCES users(id) ON DELETE CASCADE, -- Ai là người bỏ tiền túi ra trả</w:t>
+      </w:r>
+    </w:p>
+    <w:p>
+      <w:r>
+        <w:t xml:space="preserve">    title VARCHAR(255) NOT NULL,</w:t>
+      </w:r>
+    </w:p>
+    <w:p>
+      <w:r>
+        <w:t xml:space="preserve">    amount DECIMAL(15, 2) NOT NULL CHECK (amount &gt; 0), -- Số tiền (Dùng DECIMAL để tính toán chính xác)</w:t>
+      </w:r>
+    </w:p>
+    <w:p>
+      <w:r>
+        <w:t xml:space="preserve">    expense_date DATE NOT NULL,</w:t>
+      </w:r>
+    </w:p>
+    <w:p>
+      <w:r>
+        <w:t xml:space="preserve">    status VARCHAR(50) DEFAULT 'PENDING' CHECK (status IN ('PENDING', 'SETTLED')), -- Khóa bản ghi nếu đã SETTLED</w:t>
       </w:r>
     </w:p>
     <w:p>
@@ -1197,6 +1079,134 @@
     </w:p>
     <w:p>
       <w:r>
+        <w:t>-- 5. BẢNG EXPENSE_PARTICIPANTS (Những người thụ hưởng khoản chi)</w:t>
+      </w:r>
+    </w:p>
+    <w:p>
+      <w:r>
+        <w:t>-- Giải quyết bài toán: Nhà 4 người nhưng chỉ 3 người ăn chung</w:t>
+      </w:r>
+    </w:p>
+    <w:p>
+      <w:r>
+        <w:t>-- ==========================================</w:t>
+      </w:r>
+    </w:p>
+    <w:p>
+      <w:r>
+        <w:t>CREATE TABLE expense_participants (</w:t>
+      </w:r>
+    </w:p>
+    <w:p>
+      <w:r>
+        <w:t xml:space="preserve">    expense_id UUID REFERENCES expenses(id) ON DELETE CASCADE,</w:t>
+      </w:r>
+    </w:p>
+    <w:p>
+      <w:r>
+        <w:t xml:space="preserve">    user_id UUID REFERENCES users(id) ON DELETE CASCADE,</w:t>
+      </w:r>
+    </w:p>
+    <w:p>
+      <w:r>
+        <w:t xml:space="preserve">    PRIMARY KEY (expense_id, user_id) -- Khóa chính kết hợp (Composite Key)</w:t>
+      </w:r>
+    </w:p>
+    <w:p>
+      <w:r>
+        <w:t>);</w:t>
+      </w:r>
+    </w:p>
+    <w:p/>
+    <w:p>
+      <w:r>
+        <w:t>-- ==========================================</w:t>
+      </w:r>
+    </w:p>
+    <w:p>
+      <w:r>
+        <w:t>-- 6. BẢNG SETTLEMENT_BILLS (Hóa đơn công nợ của từng thành viên)</w:t>
+      </w:r>
+    </w:p>
+    <w:p>
+      <w:r>
+        <w:t>-- Tạo ra sau khi thuật toán chốt sổ chạy</w:t>
+      </w:r>
+    </w:p>
+    <w:p>
+      <w:r>
+        <w:t>-- ==========================================</w:t>
+      </w:r>
+    </w:p>
+    <w:p>
+      <w:r>
+        <w:t>CREATE TABLE settlement_bills (</w:t>
+      </w:r>
+    </w:p>
+    <w:p>
+      <w:r>
+        <w:t xml:space="preserve">    id UUID DEFAULT gen_random_uuid() PRIMARY KEY,</w:t>
+      </w:r>
+    </w:p>
+    <w:p>
+      <w:r>
+        <w:t xml:space="preserve">    settlement_id UUID REFERENCES settlements(id) ON DELETE CASCADE,</w:t>
+      </w:r>
+    </w:p>
+    <w:p>
+      <w:r>
+        <w:t xml:space="preserve">    user_id UUID REFERENCES users(id) ON DELETE CASCADE, -- Thành viên bị nợ hoặc có nợ</w:t>
+      </w:r>
+    </w:p>
+    <w:p>
+      <w:r>
+        <w:t xml:space="preserve">    amount DECIMAL(15, 2) NOT NULL, </w:t>
+      </w:r>
+    </w:p>
+    <w:p>
+      <w:r>
+        <w:t xml:space="preserve">    -- Ý nghĩa của amount: </w:t>
+      </w:r>
+    </w:p>
+    <w:p>
+      <w:r>
+        <w:t xml:space="preserve">    -- Giá trị DƯƠNG (&gt;0): Thành viên nợ Chủ hộ (Phải chuyển tiền cho chủ hộ)</w:t>
+      </w:r>
+    </w:p>
+    <w:p>
+      <w:r>
+        <w:t xml:space="preserve">    -- Giá trị ÂM (&lt;0): Thành viên đã chi lố tiền (Chủ hộ phải trả lại tiền cho người này)</w:t>
+      </w:r>
+    </w:p>
+    <w:p>
+      <w:r>
+        <w:t xml:space="preserve">    status VARCHAR(50) DEFAULT 'PENDING' CHECK (status IN ('PENDING', 'WAITING_FOR_CONFIRMATION', 'COMPLETED')),</w:t>
+      </w:r>
+    </w:p>
+    <w:p>
+      <w:r>
+        <w:lastRenderedPageBreak/>
+        <w:t xml:space="preserve">    proof_image_url TEXT, -- Đường dẫn ảnh minh chứng chuyển khoản (Lưu trên Supabase Storage)</w:t>
+      </w:r>
+    </w:p>
+    <w:p>
+      <w:r>
+        <w:t xml:space="preserve">    created_at TIMESTAMP WITH TIME ZONE DEFAULT CURRENT_TIMESTAMP</w:t>
+      </w:r>
+    </w:p>
+    <w:p>
+      <w:r>
+        <w:t>);</w:t>
+      </w:r>
+    </w:p>
+    <w:p/>
+    <w:p>
+      <w:r>
+        <w:t>-- ==========================================</w:t>
+      </w:r>
+    </w:p>
+    <w:p>
+      <w:r>
         <w:t>-- 7. BẢNG AUDIT_LOGS (Nhật ký hoạt động để đối soát)</w:t>
       </w:r>
     </w:p>
@@ -1260,6 +1270,374 @@
         <w:t>);</w:t>
       </w:r>
     </w:p>
+    <w:p>
+      <w:r>
+        <w:br/>
+      </w:r>
+    </w:p>
+    <w:p>
+      <w:r>
+        <w:br w:type="page"/>
+      </w:r>
+    </w:p>
+    <w:p>
+      <w:pPr>
+        <w:rPr>
+          <w:b/>
+          <w:bCs/>
+        </w:rPr>
+      </w:pPr>
+      <w:r>
+        <w:rPr>
+          <w:b/>
+          <w:bCs/>
+        </w:rPr>
+        <w:lastRenderedPageBreak/>
+        <w:t>Nhóm 1: Lombok (Làm gọn code Java)</w:t>
+      </w:r>
+    </w:p>
+    <w:p>
+      <w:r>
+        <w:t>Lombok là thư viện chuyên "viết hộ" các hàm rập khuôn của Java (như getter, setter).</w:t>
+      </w:r>
+    </w:p>
+    <w:p>
+      <w:pPr>
+        <w:numPr>
+          <w:ilvl w:val="0"/>
+          <w:numId w:val="22"/>
+        </w:numPr>
+      </w:pPr>
+      <w:r>
+        <w:rPr>
+          <w:b/>
+          <w:bCs/>
+        </w:rPr>
+        <w:t>@Data</w:t>
+      </w:r>
+      <w:r>
+        <w:t>: Tự động sinh ra Getter, Setter, toString(), và các hàm so sánh object. Dùng cực nhiều cho các class DTO (như LoginRequest, AuthResponse).</w:t>
+      </w:r>
+    </w:p>
+    <w:p>
+      <w:pPr>
+        <w:numPr>
+          <w:ilvl w:val="0"/>
+          <w:numId w:val="22"/>
+        </w:numPr>
+      </w:pPr>
+      <w:r>
+        <w:rPr>
+          <w:b/>
+          <w:bCs/>
+        </w:rPr>
+        <w:t>@Builder</w:t>
+      </w:r>
+      <w:r>
+        <w:t>: Cung cấp cách khởi tạo object siêu ngầu và dễ đọc.</w:t>
+      </w:r>
+    </w:p>
+    <w:p>
+      <w:pPr>
+        <w:numPr>
+          <w:ilvl w:val="1"/>
+          <w:numId w:val="22"/>
+        </w:numPr>
+      </w:pPr>
+      <w:r>
+        <w:rPr>
+          <w:i/>
+          <w:iCs/>
+        </w:rPr>
+        <w:t>Ví dụ thay vì:</w:t>
+      </w:r>
+      <w:r>
+        <w:t xml:space="preserve"> User u = new User(); u.setName("A"); u.setEmail("B");</w:t>
+      </w:r>
+    </w:p>
+    <w:p>
+      <w:pPr>
+        <w:numPr>
+          <w:ilvl w:val="1"/>
+          <w:numId w:val="22"/>
+        </w:numPr>
+      </w:pPr>
+      <w:r>
+        <w:rPr>
+          <w:i/>
+          <w:iCs/>
+        </w:rPr>
+        <w:t>Bạn viết:</w:t>
+      </w:r>
+      <w:r>
+        <w:t xml:space="preserve"> User u = User.builder().name("A").email("B").build();</w:t>
+      </w:r>
+    </w:p>
+    <w:p>
+      <w:pPr>
+        <w:numPr>
+          <w:ilvl w:val="0"/>
+          <w:numId w:val="22"/>
+        </w:numPr>
+      </w:pPr>
+      <w:r>
+        <w:rPr>
+          <w:b/>
+          <w:bCs/>
+        </w:rPr>
+        <w:t>@NoArgsConstructor / @AllArgsConstructor</w:t>
+      </w:r>
+      <w:r>
+        <w:t>: Tự động sinh hàm khởi tạo không có tham số / có tất cả tham số. (Bắt buộc phải có khi làm việc với JPA @Entity).</w:t>
+      </w:r>
+    </w:p>
+    <w:p>
+      <w:pPr>
+        <w:rPr>
+          <w:b/>
+          <w:bCs/>
+        </w:rPr>
+      </w:pPr>
+      <w:r>
+        <w:rPr>
+          <w:b/>
+          <w:bCs/>
+        </w:rPr>
+        <w:t>Nhóm 2: Spring MVC (Làm API / Controller)</w:t>
+      </w:r>
+    </w:p>
+    <w:p>
+      <w:r>
+        <w:t>Đây là các nhãn dùng để tạo ra các đường link (URL) cho Frontend gọi vào. (Chúng ta sẽ dùng chúng ở bài tiếp theo khi viết AuthController).</w:t>
+      </w:r>
+    </w:p>
+    <w:p>
+      <w:pPr>
+        <w:numPr>
+          <w:ilvl w:val="0"/>
+          <w:numId w:val="23"/>
+        </w:numPr>
+      </w:pPr>
+      <w:r>
+        <w:rPr>
+          <w:b/>
+          <w:bCs/>
+        </w:rPr>
+        <w:t>@RestController</w:t>
+      </w:r>
+      <w:r>
+        <w:t>: Đánh dấu class này là đầu mối nhận API. Kết quả trả về tự động được ép kiểu thành JSON.</w:t>
+      </w:r>
+    </w:p>
+    <w:p>
+      <w:pPr>
+        <w:numPr>
+          <w:ilvl w:val="0"/>
+          <w:numId w:val="23"/>
+        </w:numPr>
+      </w:pPr>
+      <w:r>
+        <w:rPr>
+          <w:b/>
+          <w:bCs/>
+        </w:rPr>
+        <w:t>@RequestMapping("/api/auth")</w:t>
+      </w:r>
+      <w:r>
+        <w:t>: Gắn tiền tố URL chung cho toàn bộ class (Ví dụ mọi API trong class này đều bắt đầu bằng /api/auth).</w:t>
+      </w:r>
+    </w:p>
+    <w:p>
+      <w:pPr>
+        <w:numPr>
+          <w:ilvl w:val="0"/>
+          <w:numId w:val="23"/>
+        </w:numPr>
+      </w:pPr>
+      <w:r>
+        <w:rPr>
+          <w:b/>
+          <w:bCs/>
+        </w:rPr>
+        <w:t>@GetMapping / @PostMapping / @PutMapping / @DeleteMapping</w:t>
+      </w:r>
+      <w:r>
+        <w:t>: Tương ứng với các phương thức HTTP. Ví dụ: Dùng @PostMapping("/login") cho hàm đăng nhập vì nó cần gửi mật khẩu bảo mật trong body.</w:t>
+      </w:r>
+    </w:p>
+    <w:p>
+      <w:pPr>
+        <w:numPr>
+          <w:ilvl w:val="0"/>
+          <w:numId w:val="23"/>
+        </w:numPr>
+      </w:pPr>
+      <w:r>
+        <w:rPr>
+          <w:b/>
+          <w:bCs/>
+        </w:rPr>
+        <w:t>@RequestBody</w:t>
+      </w:r>
+      <w:r>
+        <w:t>: Báo cho Spring biết hãy lấy dữ liệu JSON mà Frontend gửi lên, và tự động gán nó vào class DTO của Java (ví dụ LoginRequest).</w:t>
+      </w:r>
+    </w:p>
+    <w:p>
+      <w:pPr>
+        <w:rPr>
+          <w:b/>
+          <w:bCs/>
+        </w:rPr>
+      </w:pPr>
+      <w:r>
+        <w:rPr>
+          <w:b/>
+          <w:bCs/>
+        </w:rPr>
+        <w:t>Nhóm 3: JPA / Hibernate (Làm việc với Database)</w:t>
+      </w:r>
+    </w:p>
+    <w:p>
+      <w:r>
+        <w:t>Bạn đã dùng chúng rất tốt ở các file trong thư mục domain.</w:t>
+      </w:r>
+    </w:p>
+    <w:p>
+      <w:pPr>
+        <w:numPr>
+          <w:ilvl w:val="0"/>
+          <w:numId w:val="24"/>
+        </w:numPr>
+      </w:pPr>
+      <w:r>
+        <w:rPr>
+          <w:b/>
+          <w:bCs/>
+        </w:rPr>
+        <w:t>@Entity</w:t>
+      </w:r>
+      <w:r>
+        <w:t>: Báo cho Hibernate biết class này tương đương với 1 bảng dưới Database.</w:t>
+      </w:r>
+    </w:p>
+    <w:p>
+      <w:pPr>
+        <w:numPr>
+          <w:ilvl w:val="0"/>
+          <w:numId w:val="24"/>
+        </w:numPr>
+      </w:pPr>
+      <w:r>
+        <w:rPr>
+          <w:b/>
+          <w:bCs/>
+        </w:rPr>
+        <w:t>@Table(name = "users")</w:t>
+      </w:r>
+      <w:r>
+        <w:t>: Chỉ định đích danh tên bảng dưới SQL.</w:t>
+      </w:r>
+    </w:p>
+    <w:p>
+      <w:pPr>
+        <w:numPr>
+          <w:ilvl w:val="0"/>
+          <w:numId w:val="24"/>
+        </w:numPr>
+      </w:pPr>
+      <w:r>
+        <w:rPr>
+          <w:b/>
+          <w:bCs/>
+        </w:rPr>
+        <w:t>@Id &amp; @GeneratedValue</w:t>
+      </w:r>
+      <w:r>
+        <w:t>: Đánh dấu khóa chính (Primary Key) và cách tự động tăng (ví dụ sinh mã UUID tự động).</w:t>
+      </w:r>
+    </w:p>
+    <w:p>
+      <w:pPr>
+        <w:numPr>
+          <w:ilvl w:val="0"/>
+          <w:numId w:val="24"/>
+        </w:numPr>
+      </w:pPr>
+      <w:r>
+        <w:rPr>
+          <w:b/>
+          <w:bCs/>
+        </w:rPr>
+        <w:t>@Column</w:t>
+      </w:r>
+      <w:r>
+        <w:t>: Cấu hình chi tiết cho 1 cột (ví dụ: nullable = false là bắt buộc nhập, unique = true là không được trùng lặp).</w:t>
+      </w:r>
+    </w:p>
+    <w:p>
+      <w:pPr>
+        <w:rPr>
+          <w:b/>
+          <w:bCs/>
+        </w:rPr>
+      </w:pPr>
+      <w:r>
+        <w:rPr>
+          <w:b/>
+          <w:bCs/>
+        </w:rPr>
+        <w:lastRenderedPageBreak/>
+        <w:t>Nhóm 4: Quản lý Luồng (Core Spring)</w:t>
+      </w:r>
+    </w:p>
+    <w:p>
+      <w:pPr>
+        <w:numPr>
+          <w:ilvl w:val="0"/>
+          <w:numId w:val="25"/>
+        </w:numPr>
+      </w:pPr>
+      <w:r>
+        <w:rPr>
+          <w:b/>
+          <w:bCs/>
+        </w:rPr>
+        <w:t>@Transactional</w:t>
+      </w:r>
+      <w:r>
+        <w:t>: Cực kỳ quan trọng khi viết Service làm việc với Database (như hàm register của bạn).</w:t>
+      </w:r>
+    </w:p>
+    <w:p>
+      <w:pPr>
+        <w:numPr>
+          <w:ilvl w:val="1"/>
+          <w:numId w:val="25"/>
+        </w:numPr>
+      </w:pPr>
+      <w:r>
+        <w:rPr>
+          <w:i/>
+          <w:iCs/>
+        </w:rPr>
+        <w:t>Trường hợp sử dụng:</w:t>
+      </w:r>
+      <w:r>
+        <w:t xml:space="preserve"> Nếu trong hàm của bạn có nhiều thao tác (Ví dụ: 1. Lưu User -&gt; 2. Gửi Email -&gt; 3. Lưu Lịch sử). Nếu thao tác số 3 bị lỗi mạng sập, @Transactional sẽ lập tức </w:t>
+      </w:r>
+      <w:r>
+        <w:rPr>
+          <w:b/>
+          <w:bCs/>
+        </w:rPr>
+        <w:t>Rollback (Hoàn tác)</w:t>
+      </w:r>
+      <w:r>
+        <w:t xml:space="preserve"> lại toàn bộ, xóa </w:t>
+      </w:r>
+    </w:p>
+    <w:p/>
     <w:sectPr>
       <w:pgSz w:w="12240" w:h="15840" w:code="1"/>
       <w:pgMar w:top="1440" w:right="1440" w:bottom="1440" w:left="1440" w:header="2160" w:footer="2160" w:gutter="0"/>
@@ -2135,6 +2513,453 @@
     </w:lvl>
   </w:abstractNum>
   <w:abstractNum w:abstractNumId="6" w15:restartNumberingAfterBreak="0">
+    <w:nsid w:val="28EE63F0"/>
+    <w:multiLevelType w:val="multilevel"/>
+    <w:tmpl w:val="81F88D06"/>
+    <w:lvl w:ilvl="0">
+      <w:start w:val="1"/>
+      <w:numFmt w:val="bullet"/>
+      <w:lvlText w:val=""/>
+      <w:lvlJc w:val="left"/>
+      <w:pPr>
+        <w:tabs>
+          <w:tab w:val="num" w:pos="720"/>
+        </w:tabs>
+        <w:ind w:left="720" w:hanging="360"/>
+      </w:pPr>
+      <w:rPr>
+        <w:rFonts w:ascii="Symbol" w:hAnsi="Symbol" w:hint="default"/>
+        <w:sz w:val="20"/>
+      </w:rPr>
+    </w:lvl>
+    <w:lvl w:ilvl="1">
+      <w:start w:val="1"/>
+      <w:numFmt w:val="bullet"/>
+      <w:lvlText w:val="o"/>
+      <w:lvlJc w:val="left"/>
+      <w:pPr>
+        <w:tabs>
+          <w:tab w:val="num" w:pos="1440"/>
+        </w:tabs>
+        <w:ind w:left="1440" w:hanging="360"/>
+      </w:pPr>
+      <w:rPr>
+        <w:rFonts w:ascii="Courier New" w:hAnsi="Courier New" w:hint="default"/>
+        <w:sz w:val="20"/>
+      </w:rPr>
+    </w:lvl>
+    <w:lvl w:ilvl="2" w:tentative="1">
+      <w:start w:val="1"/>
+      <w:numFmt w:val="bullet"/>
+      <w:lvlText w:val=""/>
+      <w:lvlJc w:val="left"/>
+      <w:pPr>
+        <w:tabs>
+          <w:tab w:val="num" w:pos="2160"/>
+        </w:tabs>
+        <w:ind w:left="2160" w:hanging="360"/>
+      </w:pPr>
+      <w:rPr>
+        <w:rFonts w:ascii="Wingdings" w:hAnsi="Wingdings" w:hint="default"/>
+        <w:sz w:val="20"/>
+      </w:rPr>
+    </w:lvl>
+    <w:lvl w:ilvl="3" w:tentative="1">
+      <w:start w:val="1"/>
+      <w:numFmt w:val="bullet"/>
+      <w:lvlText w:val=""/>
+      <w:lvlJc w:val="left"/>
+      <w:pPr>
+        <w:tabs>
+          <w:tab w:val="num" w:pos="2880"/>
+        </w:tabs>
+        <w:ind w:left="2880" w:hanging="360"/>
+      </w:pPr>
+      <w:rPr>
+        <w:rFonts w:ascii="Wingdings" w:hAnsi="Wingdings" w:hint="default"/>
+        <w:sz w:val="20"/>
+      </w:rPr>
+    </w:lvl>
+    <w:lvl w:ilvl="4" w:tentative="1">
+      <w:start w:val="1"/>
+      <w:numFmt w:val="bullet"/>
+      <w:lvlText w:val=""/>
+      <w:lvlJc w:val="left"/>
+      <w:pPr>
+        <w:tabs>
+          <w:tab w:val="num" w:pos="3600"/>
+        </w:tabs>
+        <w:ind w:left="3600" w:hanging="360"/>
+      </w:pPr>
+      <w:rPr>
+        <w:rFonts w:ascii="Wingdings" w:hAnsi="Wingdings" w:hint="default"/>
+        <w:sz w:val="20"/>
+      </w:rPr>
+    </w:lvl>
+    <w:lvl w:ilvl="5" w:tentative="1">
+      <w:start w:val="1"/>
+      <w:numFmt w:val="bullet"/>
+      <w:lvlText w:val=""/>
+      <w:lvlJc w:val="left"/>
+      <w:pPr>
+        <w:tabs>
+          <w:tab w:val="num" w:pos="4320"/>
+        </w:tabs>
+        <w:ind w:left="4320" w:hanging="360"/>
+      </w:pPr>
+      <w:rPr>
+        <w:rFonts w:ascii="Wingdings" w:hAnsi="Wingdings" w:hint="default"/>
+        <w:sz w:val="20"/>
+      </w:rPr>
+    </w:lvl>
+    <w:lvl w:ilvl="6" w:tentative="1">
+      <w:start w:val="1"/>
+      <w:numFmt w:val="bullet"/>
+      <w:lvlText w:val=""/>
+      <w:lvlJc w:val="left"/>
+      <w:pPr>
+        <w:tabs>
+          <w:tab w:val="num" w:pos="5040"/>
+        </w:tabs>
+        <w:ind w:left="5040" w:hanging="360"/>
+      </w:pPr>
+      <w:rPr>
+        <w:rFonts w:ascii="Wingdings" w:hAnsi="Wingdings" w:hint="default"/>
+        <w:sz w:val="20"/>
+      </w:rPr>
+    </w:lvl>
+    <w:lvl w:ilvl="7" w:tentative="1">
+      <w:start w:val="1"/>
+      <w:numFmt w:val="bullet"/>
+      <w:lvlText w:val=""/>
+      <w:lvlJc w:val="left"/>
+      <w:pPr>
+        <w:tabs>
+          <w:tab w:val="num" w:pos="5760"/>
+        </w:tabs>
+        <w:ind w:left="5760" w:hanging="360"/>
+      </w:pPr>
+      <w:rPr>
+        <w:rFonts w:ascii="Wingdings" w:hAnsi="Wingdings" w:hint="default"/>
+        <w:sz w:val="20"/>
+      </w:rPr>
+    </w:lvl>
+    <w:lvl w:ilvl="8" w:tentative="1">
+      <w:start w:val="1"/>
+      <w:numFmt w:val="bullet"/>
+      <w:lvlText w:val=""/>
+      <w:lvlJc w:val="left"/>
+      <w:pPr>
+        <w:tabs>
+          <w:tab w:val="num" w:pos="6480"/>
+        </w:tabs>
+        <w:ind w:left="6480" w:hanging="360"/>
+      </w:pPr>
+      <w:rPr>
+        <w:rFonts w:ascii="Wingdings" w:hAnsi="Wingdings" w:hint="default"/>
+        <w:sz w:val="20"/>
+      </w:rPr>
+    </w:lvl>
+  </w:abstractNum>
+  <w:abstractNum w:abstractNumId="7" w15:restartNumberingAfterBreak="0">
+    <w:nsid w:val="2B564BD9"/>
+    <w:multiLevelType w:val="multilevel"/>
+    <w:tmpl w:val="33CA2C58"/>
+    <w:lvl w:ilvl="0">
+      <w:start w:val="1"/>
+      <w:numFmt w:val="bullet"/>
+      <w:lvlText w:val=""/>
+      <w:lvlJc w:val="left"/>
+      <w:pPr>
+        <w:tabs>
+          <w:tab w:val="num" w:pos="720"/>
+        </w:tabs>
+        <w:ind w:left="720" w:hanging="360"/>
+      </w:pPr>
+      <w:rPr>
+        <w:rFonts w:ascii="Symbol" w:hAnsi="Symbol" w:hint="default"/>
+        <w:sz w:val="20"/>
+      </w:rPr>
+    </w:lvl>
+    <w:lvl w:ilvl="1" w:tentative="1">
+      <w:start w:val="1"/>
+      <w:numFmt w:val="bullet"/>
+      <w:lvlText w:val="o"/>
+      <w:lvlJc w:val="left"/>
+      <w:pPr>
+        <w:tabs>
+          <w:tab w:val="num" w:pos="1440"/>
+        </w:tabs>
+        <w:ind w:left="1440" w:hanging="360"/>
+      </w:pPr>
+      <w:rPr>
+        <w:rFonts w:ascii="Courier New" w:hAnsi="Courier New" w:hint="default"/>
+        <w:sz w:val="20"/>
+      </w:rPr>
+    </w:lvl>
+    <w:lvl w:ilvl="2" w:tentative="1">
+      <w:start w:val="1"/>
+      <w:numFmt w:val="bullet"/>
+      <w:lvlText w:val=""/>
+      <w:lvlJc w:val="left"/>
+      <w:pPr>
+        <w:tabs>
+          <w:tab w:val="num" w:pos="2160"/>
+        </w:tabs>
+        <w:ind w:left="2160" w:hanging="360"/>
+      </w:pPr>
+      <w:rPr>
+        <w:rFonts w:ascii="Wingdings" w:hAnsi="Wingdings" w:hint="default"/>
+        <w:sz w:val="20"/>
+      </w:rPr>
+    </w:lvl>
+    <w:lvl w:ilvl="3" w:tentative="1">
+      <w:start w:val="1"/>
+      <w:numFmt w:val="bullet"/>
+      <w:lvlText w:val=""/>
+      <w:lvlJc w:val="left"/>
+      <w:pPr>
+        <w:tabs>
+          <w:tab w:val="num" w:pos="2880"/>
+        </w:tabs>
+        <w:ind w:left="2880" w:hanging="360"/>
+      </w:pPr>
+      <w:rPr>
+        <w:rFonts w:ascii="Wingdings" w:hAnsi="Wingdings" w:hint="default"/>
+        <w:sz w:val="20"/>
+      </w:rPr>
+    </w:lvl>
+    <w:lvl w:ilvl="4" w:tentative="1">
+      <w:start w:val="1"/>
+      <w:numFmt w:val="bullet"/>
+      <w:lvlText w:val=""/>
+      <w:lvlJc w:val="left"/>
+      <w:pPr>
+        <w:tabs>
+          <w:tab w:val="num" w:pos="3600"/>
+        </w:tabs>
+        <w:ind w:left="3600" w:hanging="360"/>
+      </w:pPr>
+      <w:rPr>
+        <w:rFonts w:ascii="Wingdings" w:hAnsi="Wingdings" w:hint="default"/>
+        <w:sz w:val="20"/>
+      </w:rPr>
+    </w:lvl>
+    <w:lvl w:ilvl="5" w:tentative="1">
+      <w:start w:val="1"/>
+      <w:numFmt w:val="bullet"/>
+      <w:lvlText w:val=""/>
+      <w:lvlJc w:val="left"/>
+      <w:pPr>
+        <w:tabs>
+          <w:tab w:val="num" w:pos="4320"/>
+        </w:tabs>
+        <w:ind w:left="4320" w:hanging="360"/>
+      </w:pPr>
+      <w:rPr>
+        <w:rFonts w:ascii="Wingdings" w:hAnsi="Wingdings" w:hint="default"/>
+        <w:sz w:val="20"/>
+      </w:rPr>
+    </w:lvl>
+    <w:lvl w:ilvl="6" w:tentative="1">
+      <w:start w:val="1"/>
+      <w:numFmt w:val="bullet"/>
+      <w:lvlText w:val=""/>
+      <w:lvlJc w:val="left"/>
+      <w:pPr>
+        <w:tabs>
+          <w:tab w:val="num" w:pos="5040"/>
+        </w:tabs>
+        <w:ind w:left="5040" w:hanging="360"/>
+      </w:pPr>
+      <w:rPr>
+        <w:rFonts w:ascii="Wingdings" w:hAnsi="Wingdings" w:hint="default"/>
+        <w:sz w:val="20"/>
+      </w:rPr>
+    </w:lvl>
+    <w:lvl w:ilvl="7" w:tentative="1">
+      <w:start w:val="1"/>
+      <w:numFmt w:val="bullet"/>
+      <w:lvlText w:val=""/>
+      <w:lvlJc w:val="left"/>
+      <w:pPr>
+        <w:tabs>
+          <w:tab w:val="num" w:pos="5760"/>
+        </w:tabs>
+        <w:ind w:left="5760" w:hanging="360"/>
+      </w:pPr>
+      <w:rPr>
+        <w:rFonts w:ascii="Wingdings" w:hAnsi="Wingdings" w:hint="default"/>
+        <w:sz w:val="20"/>
+      </w:rPr>
+    </w:lvl>
+    <w:lvl w:ilvl="8" w:tentative="1">
+      <w:start w:val="1"/>
+      <w:numFmt w:val="bullet"/>
+      <w:lvlText w:val=""/>
+      <w:lvlJc w:val="left"/>
+      <w:pPr>
+        <w:tabs>
+          <w:tab w:val="num" w:pos="6480"/>
+        </w:tabs>
+        <w:ind w:left="6480" w:hanging="360"/>
+      </w:pPr>
+      <w:rPr>
+        <w:rFonts w:ascii="Wingdings" w:hAnsi="Wingdings" w:hint="default"/>
+        <w:sz w:val="20"/>
+      </w:rPr>
+    </w:lvl>
+  </w:abstractNum>
+  <w:abstractNum w:abstractNumId="8" w15:restartNumberingAfterBreak="0">
+    <w:nsid w:val="35DD1A65"/>
+    <w:multiLevelType w:val="multilevel"/>
+    <w:tmpl w:val="70C256FC"/>
+    <w:lvl w:ilvl="0">
+      <w:start w:val="1"/>
+      <w:numFmt w:val="bullet"/>
+      <w:lvlText w:val=""/>
+      <w:lvlJc w:val="left"/>
+      <w:pPr>
+        <w:tabs>
+          <w:tab w:val="num" w:pos="720"/>
+        </w:tabs>
+        <w:ind w:left="720" w:hanging="360"/>
+      </w:pPr>
+      <w:rPr>
+        <w:rFonts w:ascii="Symbol" w:hAnsi="Symbol" w:hint="default"/>
+        <w:sz w:val="20"/>
+      </w:rPr>
+    </w:lvl>
+    <w:lvl w:ilvl="1" w:tentative="1">
+      <w:start w:val="1"/>
+      <w:numFmt w:val="bullet"/>
+      <w:lvlText w:val="o"/>
+      <w:lvlJc w:val="left"/>
+      <w:pPr>
+        <w:tabs>
+          <w:tab w:val="num" w:pos="1440"/>
+        </w:tabs>
+        <w:ind w:left="1440" w:hanging="360"/>
+      </w:pPr>
+      <w:rPr>
+        <w:rFonts w:ascii="Courier New" w:hAnsi="Courier New" w:hint="default"/>
+        <w:sz w:val="20"/>
+      </w:rPr>
+    </w:lvl>
+    <w:lvl w:ilvl="2" w:tentative="1">
+      <w:start w:val="1"/>
+      <w:numFmt w:val="bullet"/>
+      <w:lvlText w:val=""/>
+      <w:lvlJc w:val="left"/>
+      <w:pPr>
+        <w:tabs>
+          <w:tab w:val="num" w:pos="2160"/>
+        </w:tabs>
+        <w:ind w:left="2160" w:hanging="360"/>
+      </w:pPr>
+      <w:rPr>
+        <w:rFonts w:ascii="Wingdings" w:hAnsi="Wingdings" w:hint="default"/>
+        <w:sz w:val="20"/>
+      </w:rPr>
+    </w:lvl>
+    <w:lvl w:ilvl="3" w:tentative="1">
+      <w:start w:val="1"/>
+      <w:numFmt w:val="bullet"/>
+      <w:lvlText w:val=""/>
+      <w:lvlJc w:val="left"/>
+      <w:pPr>
+        <w:tabs>
+          <w:tab w:val="num" w:pos="2880"/>
+        </w:tabs>
+        <w:ind w:left="2880" w:hanging="360"/>
+      </w:pPr>
+      <w:rPr>
+        <w:rFonts w:ascii="Wingdings" w:hAnsi="Wingdings" w:hint="default"/>
+        <w:sz w:val="20"/>
+      </w:rPr>
+    </w:lvl>
+    <w:lvl w:ilvl="4" w:tentative="1">
+      <w:start w:val="1"/>
+      <w:numFmt w:val="bullet"/>
+      <w:lvlText w:val=""/>
+      <w:lvlJc w:val="left"/>
+      <w:pPr>
+        <w:tabs>
+          <w:tab w:val="num" w:pos="3600"/>
+        </w:tabs>
+        <w:ind w:left="3600" w:hanging="360"/>
+      </w:pPr>
+      <w:rPr>
+        <w:rFonts w:ascii="Wingdings" w:hAnsi="Wingdings" w:hint="default"/>
+        <w:sz w:val="20"/>
+      </w:rPr>
+    </w:lvl>
+    <w:lvl w:ilvl="5" w:tentative="1">
+      <w:start w:val="1"/>
+      <w:numFmt w:val="bullet"/>
+      <w:lvlText w:val=""/>
+      <w:lvlJc w:val="left"/>
+      <w:pPr>
+        <w:tabs>
+          <w:tab w:val="num" w:pos="4320"/>
+        </w:tabs>
+        <w:ind w:left="4320" w:hanging="360"/>
+      </w:pPr>
+      <w:rPr>
+        <w:rFonts w:ascii="Wingdings" w:hAnsi="Wingdings" w:hint="default"/>
+        <w:sz w:val="20"/>
+      </w:rPr>
+    </w:lvl>
+    <w:lvl w:ilvl="6" w:tentative="1">
+      <w:start w:val="1"/>
+      <w:numFmt w:val="bullet"/>
+      <w:lvlText w:val=""/>
+      <w:lvlJc w:val="left"/>
+      <w:pPr>
+        <w:tabs>
+          <w:tab w:val="num" w:pos="5040"/>
+        </w:tabs>
+        <w:ind w:left="5040" w:hanging="360"/>
+      </w:pPr>
+      <w:rPr>
+        <w:rFonts w:ascii="Wingdings" w:hAnsi="Wingdings" w:hint="default"/>
+        <w:sz w:val="20"/>
+      </w:rPr>
+    </w:lvl>
+    <w:lvl w:ilvl="7" w:tentative="1">
+      <w:start w:val="1"/>
+      <w:numFmt w:val="bullet"/>
+      <w:lvlText w:val=""/>
+      <w:lvlJc w:val="left"/>
+      <w:pPr>
+        <w:tabs>
+          <w:tab w:val="num" w:pos="5760"/>
+        </w:tabs>
+        <w:ind w:left="5760" w:hanging="360"/>
+      </w:pPr>
+      <w:rPr>
+        <w:rFonts w:ascii="Wingdings" w:hAnsi="Wingdings" w:hint="default"/>
+        <w:sz w:val="20"/>
+      </w:rPr>
+    </w:lvl>
+    <w:lvl w:ilvl="8" w:tentative="1">
+      <w:start w:val="1"/>
+      <w:numFmt w:val="bullet"/>
+      <w:lvlText w:val=""/>
+      <w:lvlJc w:val="left"/>
+      <w:pPr>
+        <w:tabs>
+          <w:tab w:val="num" w:pos="6480"/>
+        </w:tabs>
+        <w:ind w:left="6480" w:hanging="360"/>
+      </w:pPr>
+      <w:rPr>
+        <w:rFonts w:ascii="Wingdings" w:hAnsi="Wingdings" w:hint="default"/>
+        <w:sz w:val="20"/>
+      </w:rPr>
+    </w:lvl>
+  </w:abstractNum>
+  <w:abstractNum w:abstractNumId="9" w15:restartNumberingAfterBreak="0">
     <w:nsid w:val="3CCC1F21"/>
     <w:multiLevelType w:val="multilevel"/>
     <w:tmpl w:val="DF567D68"/>
@@ -2283,7 +3108,156 @@
       </w:rPr>
     </w:lvl>
   </w:abstractNum>
-  <w:abstractNum w:abstractNumId="7" w15:restartNumberingAfterBreak="0">
+  <w:abstractNum w:abstractNumId="10" w15:restartNumberingAfterBreak="0">
+    <w:nsid w:val="3E481442"/>
+    <w:multiLevelType w:val="multilevel"/>
+    <w:tmpl w:val="92D6B8AC"/>
+    <w:lvl w:ilvl="0">
+      <w:start w:val="1"/>
+      <w:numFmt w:val="bullet"/>
+      <w:lvlText w:val=""/>
+      <w:lvlJc w:val="left"/>
+      <w:pPr>
+        <w:tabs>
+          <w:tab w:val="num" w:pos="720"/>
+        </w:tabs>
+        <w:ind w:left="720" w:hanging="360"/>
+      </w:pPr>
+      <w:rPr>
+        <w:rFonts w:ascii="Symbol" w:hAnsi="Symbol" w:hint="default"/>
+        <w:sz w:val="20"/>
+      </w:rPr>
+    </w:lvl>
+    <w:lvl w:ilvl="1">
+      <w:start w:val="1"/>
+      <w:numFmt w:val="bullet"/>
+      <w:lvlText w:val="o"/>
+      <w:lvlJc w:val="left"/>
+      <w:pPr>
+        <w:tabs>
+          <w:tab w:val="num" w:pos="1440"/>
+        </w:tabs>
+        <w:ind w:left="1440" w:hanging="360"/>
+      </w:pPr>
+      <w:rPr>
+        <w:rFonts w:ascii="Courier New" w:hAnsi="Courier New" w:hint="default"/>
+        <w:sz w:val="20"/>
+      </w:rPr>
+    </w:lvl>
+    <w:lvl w:ilvl="2" w:tentative="1">
+      <w:start w:val="1"/>
+      <w:numFmt w:val="bullet"/>
+      <w:lvlText w:val=""/>
+      <w:lvlJc w:val="left"/>
+      <w:pPr>
+        <w:tabs>
+          <w:tab w:val="num" w:pos="2160"/>
+        </w:tabs>
+        <w:ind w:left="2160" w:hanging="360"/>
+      </w:pPr>
+      <w:rPr>
+        <w:rFonts w:ascii="Wingdings" w:hAnsi="Wingdings" w:hint="default"/>
+        <w:sz w:val="20"/>
+      </w:rPr>
+    </w:lvl>
+    <w:lvl w:ilvl="3" w:tentative="1">
+      <w:start w:val="1"/>
+      <w:numFmt w:val="bullet"/>
+      <w:lvlText w:val=""/>
+      <w:lvlJc w:val="left"/>
+      <w:pPr>
+        <w:tabs>
+          <w:tab w:val="num" w:pos="2880"/>
+        </w:tabs>
+        <w:ind w:left="2880" w:hanging="360"/>
+      </w:pPr>
+      <w:rPr>
+        <w:rFonts w:ascii="Wingdings" w:hAnsi="Wingdings" w:hint="default"/>
+        <w:sz w:val="20"/>
+      </w:rPr>
+    </w:lvl>
+    <w:lvl w:ilvl="4" w:tentative="1">
+      <w:start w:val="1"/>
+      <w:numFmt w:val="bullet"/>
+      <w:lvlText w:val=""/>
+      <w:lvlJc w:val="left"/>
+      <w:pPr>
+        <w:tabs>
+          <w:tab w:val="num" w:pos="3600"/>
+        </w:tabs>
+        <w:ind w:left="3600" w:hanging="360"/>
+      </w:pPr>
+      <w:rPr>
+        <w:rFonts w:ascii="Wingdings" w:hAnsi="Wingdings" w:hint="default"/>
+        <w:sz w:val="20"/>
+      </w:rPr>
+    </w:lvl>
+    <w:lvl w:ilvl="5" w:tentative="1">
+      <w:start w:val="1"/>
+      <w:numFmt w:val="bullet"/>
+      <w:lvlText w:val=""/>
+      <w:lvlJc w:val="left"/>
+      <w:pPr>
+        <w:tabs>
+          <w:tab w:val="num" w:pos="4320"/>
+        </w:tabs>
+        <w:ind w:left="4320" w:hanging="360"/>
+      </w:pPr>
+      <w:rPr>
+        <w:rFonts w:ascii="Wingdings" w:hAnsi="Wingdings" w:hint="default"/>
+        <w:sz w:val="20"/>
+      </w:rPr>
+    </w:lvl>
+    <w:lvl w:ilvl="6" w:tentative="1">
+      <w:start w:val="1"/>
+      <w:numFmt w:val="bullet"/>
+      <w:lvlText w:val=""/>
+      <w:lvlJc w:val="left"/>
+      <w:pPr>
+        <w:tabs>
+          <w:tab w:val="num" w:pos="5040"/>
+        </w:tabs>
+        <w:ind w:left="5040" w:hanging="360"/>
+      </w:pPr>
+      <w:rPr>
+        <w:rFonts w:ascii="Wingdings" w:hAnsi="Wingdings" w:hint="default"/>
+        <w:sz w:val="20"/>
+      </w:rPr>
+    </w:lvl>
+    <w:lvl w:ilvl="7" w:tentative="1">
+      <w:start w:val="1"/>
+      <w:numFmt w:val="bullet"/>
+      <w:lvlText w:val=""/>
+      <w:lvlJc w:val="left"/>
+      <w:pPr>
+        <w:tabs>
+          <w:tab w:val="num" w:pos="5760"/>
+        </w:tabs>
+        <w:ind w:left="5760" w:hanging="360"/>
+      </w:pPr>
+      <w:rPr>
+        <w:rFonts w:ascii="Wingdings" w:hAnsi="Wingdings" w:hint="default"/>
+        <w:sz w:val="20"/>
+      </w:rPr>
+    </w:lvl>
+    <w:lvl w:ilvl="8" w:tentative="1">
+      <w:start w:val="1"/>
+      <w:numFmt w:val="bullet"/>
+      <w:lvlText w:val=""/>
+      <w:lvlJc w:val="left"/>
+      <w:pPr>
+        <w:tabs>
+          <w:tab w:val="num" w:pos="6480"/>
+        </w:tabs>
+        <w:ind w:left="6480" w:hanging="360"/>
+      </w:pPr>
+      <w:rPr>
+        <w:rFonts w:ascii="Wingdings" w:hAnsi="Wingdings" w:hint="default"/>
+        <w:sz w:val="20"/>
+      </w:rPr>
+    </w:lvl>
+  </w:abstractNum>
+  <w:abstractNum w:abstractNumId="11" w15:restartNumberingAfterBreak="0">
     <w:nsid w:val="4BE84D3F"/>
     <w:multiLevelType w:val="multilevel"/>
     <w:tmpl w:val="44C83F80"/>
@@ -2432,7 +3406,7 @@
       </w:rPr>
     </w:lvl>
   </w:abstractNum>
-  <w:abstractNum w:abstractNumId="8" w15:restartNumberingAfterBreak="0">
+  <w:abstractNum w:abstractNumId="12" w15:restartNumberingAfterBreak="0">
     <w:nsid w:val="4FB50FEC"/>
     <w:multiLevelType w:val="multilevel"/>
     <w:tmpl w:val="F8DE0768"/>
@@ -2581,7 +3555,7 @@
       </w:rPr>
     </w:lvl>
   </w:abstractNum>
-  <w:abstractNum w:abstractNumId="9" w15:restartNumberingAfterBreak="0">
+  <w:abstractNum w:abstractNumId="13" w15:restartNumberingAfterBreak="0">
     <w:nsid w:val="52C10887"/>
     <w:multiLevelType w:val="multilevel"/>
     <w:tmpl w:val="CD1678A0"/>
@@ -2730,7 +3704,7 @@
       </w:rPr>
     </w:lvl>
   </w:abstractNum>
-  <w:abstractNum w:abstractNumId="10" w15:restartNumberingAfterBreak="0">
+  <w:abstractNum w:abstractNumId="14" w15:restartNumberingAfterBreak="0">
     <w:nsid w:val="55305399"/>
     <w:multiLevelType w:val="multilevel"/>
     <w:tmpl w:val="D4E62722"/>
@@ -2879,7 +3853,7 @@
       </w:rPr>
     </w:lvl>
   </w:abstractNum>
-  <w:abstractNum w:abstractNumId="11" w15:restartNumberingAfterBreak="0">
+  <w:abstractNum w:abstractNumId="15" w15:restartNumberingAfterBreak="0">
     <w:nsid w:val="561F38C7"/>
     <w:multiLevelType w:val="multilevel"/>
     <w:tmpl w:val="D15A29FC"/>
@@ -3028,7 +4002,7 @@
       </w:rPr>
     </w:lvl>
   </w:abstractNum>
-  <w:abstractNum w:abstractNumId="12" w15:restartNumberingAfterBreak="0">
+  <w:abstractNum w:abstractNumId="16" w15:restartNumberingAfterBreak="0">
     <w:nsid w:val="627D339B"/>
     <w:multiLevelType w:val="multilevel"/>
     <w:tmpl w:val="208AB5A0"/>
@@ -3177,7 +4151,7 @@
       </w:rPr>
     </w:lvl>
   </w:abstractNum>
-  <w:abstractNum w:abstractNumId="13" w15:restartNumberingAfterBreak="0">
+  <w:abstractNum w:abstractNumId="17" w15:restartNumberingAfterBreak="0">
     <w:nsid w:val="6DAD5841"/>
     <w:multiLevelType w:val="multilevel"/>
     <w:tmpl w:val="1EAE6FAC"/>
@@ -3326,7 +4300,7 @@
       </w:rPr>
     </w:lvl>
   </w:abstractNum>
-  <w:abstractNum w:abstractNumId="14" w15:restartNumberingAfterBreak="0">
+  <w:abstractNum w:abstractNumId="18" w15:restartNumberingAfterBreak="0">
     <w:nsid w:val="6E255B4E"/>
     <w:multiLevelType w:val="multilevel"/>
     <w:tmpl w:val="F2486F28"/>
@@ -3475,7 +4449,7 @@
       </w:rPr>
     </w:lvl>
   </w:abstractNum>
-  <w:abstractNum w:abstractNumId="15" w15:restartNumberingAfterBreak="0">
+  <w:abstractNum w:abstractNumId="19" w15:restartNumberingAfterBreak="0">
     <w:nsid w:val="76765306"/>
     <w:multiLevelType w:val="multilevel"/>
     <w:tmpl w:val="ABCE7CD0"/>
@@ -3624,7 +4598,7 @@
       </w:rPr>
     </w:lvl>
   </w:abstractNum>
-  <w:abstractNum w:abstractNumId="16" w15:restartNumberingAfterBreak="0">
+  <w:abstractNum w:abstractNumId="20" w15:restartNumberingAfterBreak="0">
     <w:nsid w:val="783F4A41"/>
     <w:multiLevelType w:val="multilevel"/>
     <w:tmpl w:val="C510726C"/>
@@ -3773,7 +4747,7 @@
       </w:rPr>
     </w:lvl>
   </w:abstractNum>
-  <w:abstractNum w:abstractNumId="17" w15:restartNumberingAfterBreak="0">
+  <w:abstractNum w:abstractNumId="21" w15:restartNumberingAfterBreak="0">
     <w:nsid w:val="79E815A4"/>
     <w:multiLevelType w:val="multilevel"/>
     <w:tmpl w:val="B026203A"/>
@@ -3922,7 +4896,7 @@
       </w:rPr>
     </w:lvl>
   </w:abstractNum>
-  <w:abstractNum w:abstractNumId="18" w15:restartNumberingAfterBreak="0">
+  <w:abstractNum w:abstractNumId="22" w15:restartNumberingAfterBreak="0">
     <w:nsid w:val="7ABD743D"/>
     <w:multiLevelType w:val="multilevel"/>
     <w:tmpl w:val="293ADA16"/>
@@ -4071,7 +5045,7 @@
       </w:rPr>
     </w:lvl>
   </w:abstractNum>
-  <w:abstractNum w:abstractNumId="19" w15:restartNumberingAfterBreak="0">
+  <w:abstractNum w:abstractNumId="23" w15:restartNumberingAfterBreak="0">
     <w:nsid w:val="7ABE1DA4"/>
     <w:multiLevelType w:val="multilevel"/>
     <w:tmpl w:val="9E3A7EDE"/>
@@ -4220,7 +5194,7 @@
       </w:rPr>
     </w:lvl>
   </w:abstractNum>
-  <w:abstractNum w:abstractNumId="20" w15:restartNumberingAfterBreak="0">
+  <w:abstractNum w:abstractNumId="24" w15:restartNumberingAfterBreak="0">
     <w:nsid w:val="7ACB1E92"/>
     <w:multiLevelType w:val="multilevel"/>
     <w:tmpl w:val="E8D8676C"/>
@@ -4373,64 +5347,76 @@
     <w:abstractNumId w:val="4"/>
   </w:num>
   <w:num w:numId="2" w16cid:durableId="1321882033">
-    <w:abstractNumId w:val="8"/>
+    <w:abstractNumId w:val="12"/>
   </w:num>
   <w:num w:numId="3" w16cid:durableId="1097363206">
-    <w:abstractNumId w:val="7"/>
+    <w:abstractNumId w:val="11"/>
   </w:num>
   <w:num w:numId="4" w16cid:durableId="762144274">
     <w:abstractNumId w:val="2"/>
   </w:num>
   <w:num w:numId="5" w16cid:durableId="256060021">
-    <w:abstractNumId w:val="18"/>
+    <w:abstractNumId w:val="22"/>
   </w:num>
   <w:num w:numId="6" w16cid:durableId="1490244411">
-    <w:abstractNumId w:val="15"/>
+    <w:abstractNumId w:val="19"/>
   </w:num>
   <w:num w:numId="7" w16cid:durableId="2070494151">
-    <w:abstractNumId w:val="9"/>
+    <w:abstractNumId w:val="13"/>
   </w:num>
   <w:num w:numId="8" w16cid:durableId="1034572072">
-    <w:abstractNumId w:val="13"/>
+    <w:abstractNumId w:val="17"/>
   </w:num>
   <w:num w:numId="9" w16cid:durableId="62145272">
     <w:abstractNumId w:val="3"/>
   </w:num>
   <w:num w:numId="10" w16cid:durableId="261691603">
-    <w:abstractNumId w:val="16"/>
+    <w:abstractNumId w:val="20"/>
   </w:num>
   <w:num w:numId="11" w16cid:durableId="310522348">
     <w:abstractNumId w:val="0"/>
   </w:num>
   <w:num w:numId="12" w16cid:durableId="439182031">
-    <w:abstractNumId w:val="12"/>
+    <w:abstractNumId w:val="16"/>
   </w:num>
   <w:num w:numId="13" w16cid:durableId="14156699">
-    <w:abstractNumId w:val="20"/>
+    <w:abstractNumId w:val="24"/>
   </w:num>
   <w:num w:numId="14" w16cid:durableId="1531645599">
-    <w:abstractNumId w:val="14"/>
+    <w:abstractNumId w:val="18"/>
   </w:num>
   <w:num w:numId="15" w16cid:durableId="970403958">
     <w:abstractNumId w:val="5"/>
   </w:num>
   <w:num w:numId="16" w16cid:durableId="2029597787">
-    <w:abstractNumId w:val="11"/>
+    <w:abstractNumId w:val="15"/>
   </w:num>
   <w:num w:numId="17" w16cid:durableId="1120950887">
-    <w:abstractNumId w:val="10"/>
+    <w:abstractNumId w:val="14"/>
   </w:num>
   <w:num w:numId="18" w16cid:durableId="1702784517">
-    <w:abstractNumId w:val="17"/>
+    <w:abstractNumId w:val="21"/>
   </w:num>
   <w:num w:numId="19" w16cid:durableId="1480926191">
     <w:abstractNumId w:val="1"/>
   </w:num>
   <w:num w:numId="20" w16cid:durableId="1357579470">
+    <w:abstractNumId w:val="9"/>
+  </w:num>
+  <w:num w:numId="21" w16cid:durableId="1386835681">
+    <w:abstractNumId w:val="23"/>
+  </w:num>
+  <w:num w:numId="22" w16cid:durableId="1447653888">
     <w:abstractNumId w:val="6"/>
   </w:num>
-  <w:num w:numId="21" w16cid:durableId="1386835681">
-    <w:abstractNumId w:val="19"/>
+  <w:num w:numId="23" w16cid:durableId="1263418412">
+    <w:abstractNumId w:val="7"/>
+  </w:num>
+  <w:num w:numId="24" w16cid:durableId="1231647879">
+    <w:abstractNumId w:val="8"/>
+  </w:num>
+  <w:num w:numId="25" w16cid:durableId="727454270">
+    <w:abstractNumId w:val="10"/>
   </w:num>
 </w:numbering>
 </file>

</xml_diff>